<commit_message>
Quitar guion de beq/lbu del documento (es parte de los companeros)
</commit_message>
<xml_diff>
--- a/Guion_Presentacion_Completa.docx
+++ b/Guion_Presentacion_Completa.docx
@@ -91,7 +91,7 @@
                 <w:sz w:val="22"/>
                 <w:szCs w:val="22"/>
               </w:rPr>
-              <w:t xml:space="preserve">Cubre todo el deck actual. Las partes que no son tuyas (slides compartidas, beq, lbu) están en versión corta, solo para que sepas el hilo completo y puedas seguir si alguien se traba. Tu parte fuerte (sb) tiene el detalle completo en Guion_QA_sb.md — acá va la versión resumida para no repetir.</w:t>
+              <w:t xml:space="preserve">Cubre las slides compartidas y tu parte (sb). Las slides de tus compañeros (beq, lbu) no llevan guion acá — es su instrucción, cada uno arma su propia explicación. Solo se dejan marcadas con el tiempo estimado. Tu parte fuerte (sb) tiene el detalle completo en Guion_QA_sb.md — acá va la versión resumida para no repetir.</w:t>
             </w:r>
           </w:p>
         </w:tc>
@@ -689,7 +689,7 @@
           <w:sz w:val="26"/>
           <w:szCs w:val="26"/>
         </w:rPr>
-        <w:t xml:space="preserve">Slide 8 — Datapath beq (para quien la presente)</w:t>
+        <w:t xml:space="preserve">Slide 8 — Datapath beq (la presenta tu compañero)</w:t>
       </w:r>
       <w:r>
         <w:rPr>
@@ -746,7 +746,7 @@
                 <w:sz w:val="23"/>
                 <w:szCs w:val="23"/>
               </w:rPr>
-              <w:t xml:space="preserve">“La instrucción es beq $t1, $zero, fin: compara si $t1 es igual a cero, y si es así, salta a la etiqueta fin. El opcode 000100 prende Branch y pone ALUOp en 01 (resta), porque la ALU calcula $t1 - $zero y usa la señal Zero para decidir si son iguales. No hay escritura en memoria ni en registros — beq solo compara y decide si saltar. Por eso todo el camino de arriba (el cálculo de la dirección de salto con Shift-left-2 y el sumador de branch) está activo, junto con la compuerta AND que combina Branch con Zero para decidir el próximo PC.”</w:t>
+              <w:t xml:space="preserve">(No es tu parte — cada uno arma su propio guion para su instrucción.)</w:t>
             </w:r>
           </w:p>
         </w:tc>
@@ -769,7 +769,7 @@
           <w:sz w:val="26"/>
           <w:szCs w:val="26"/>
         </w:rPr>
-        <w:t xml:space="preserve">Slide 9 — Datapath lbu (para quien la presente)</w:t>
+        <w:t xml:space="preserve">Slide 9 — Datapath lbu (la presenta tu compañero)</w:t>
       </w:r>
       <w:r>
         <w:rPr>
@@ -826,7 +826,7 @@
                 <w:sz w:val="23"/>
                 <w:szCs w:val="23"/>
               </w:rPr>
-              <w:t xml:space="preserve">“La instrucción es lbu $t1, 0($t0): carga el byte en la dirección $t0 y lo guarda en $t1. El opcode 100100 prende MemRead y RegWrite, y MemtoReg, porque el dato que se escribe en el registro viene de memoria, no de la ALU. Es exactamente el camino contrario al de sb: acá el dato sale de memoria y entra a un registro.”</w:t>
+              <w:t xml:space="preserve">(No es tu parte — cada uno arma su propio guion para su instrucción.)</w:t>
             </w:r>
           </w:p>
         </w:tc>
@@ -1036,7 +1036,7 @@
         <w:jc w:val="left"/>
       </w:pPr>
       <w:r>
-        <w:t xml:space="preserve">Las slides 8 y 9 (beq, lbu) están resumidas porque no son tu parte — no hace falta que te las aprendas al detalle, solo para que entiendas el hilo si alguien pregunta algo cruzado (“¿en qué se parece tu instrucción a la de tu compañero?”).</w:t>
+        <w:t xml:space="preserve">Las slides 8 y 9 (beq, lbu) no llevan guion porque son la instrucción de tus compañeros — cada uno prepara la suya.</w:t>
       </w:r>
     </w:p>
     <w:p>

</xml_diff>